<commit_message>
Add Deliverable_1 PDF and update prep.docx
Add the Deliverable_1 PDF and update the prep.docx file in Deliverable_1. The PDF is a new file (submission deliverable) and the DOCX was modified to revise preparatory material.
</commit_message>
<xml_diff>
--- a/Deliverable_1/prep.docx
+++ b/Deliverable_1/prep.docx
@@ -3,18 +3,24 @@
 <w:document xmlns:wpc="http://schemas.microsoft.com/office/word/2010/wordprocessingCanvas" xmlns:cx="http://schemas.microsoft.com/office/drawing/2014/chartex" xmlns:cx1="http://schemas.microsoft.com/office/drawing/2015/9/8/chartex" xmlns:cx2="http://schemas.microsoft.com/office/drawing/2015/10/21/chartex" xmlns:cx3="http://schemas.microsoft.com/office/drawing/2016/5/9/chartex" xmlns:cx4="http://schemas.microsoft.com/office/drawing/2016/5/10/chartex" xmlns:cx5="http://schemas.microsoft.com/office/drawing/2016/5/11/chartex" xmlns:cx6="http://schemas.microsoft.com/office/drawing/2016/5/12/chartex" xmlns:cx7="http://schemas.microsoft.com/office/drawing/2016/5/13/chartex" xmlns:cx8="http://schemas.microsoft.com/office/drawing/2016/5/14/chartex" xmlns:mc="http://schemas.openxmlformats.org/markup-compatibility/2006" xmlns:aink="http://schemas.microsoft.com/office/drawing/2016/ink" xmlns:am3d="http://schemas.microsoft.com/office/drawing/2017/model3d" xmlns:o="urn:schemas-microsoft-com:office:office" xmlns:oel="http://schemas.microsoft.com/office/2019/extlst" xmlns:r="http://schemas.openxmlformats.org/officeDocument/2006/relationships" xmlns:m="http://schemas.openxmlformats.org/officeDocument/2006/math" xmlns:v="urn:schemas-microsoft-com:vml" xmlns:wp14="http://schemas.microsoft.com/office/word/2010/wordprocessingDrawing" xmlns:wp="http://schemas.openxmlformats.org/drawingml/2006/wordprocessingDrawing" xmlns:w10="urn:schemas-microsoft-com:office:word" xmlns:w="http://schemas.openxmlformats.org/wordprocessingml/2006/main" xmlns:w14="http://schemas.microsoft.com/office/word/2010/wordml" xmlns:w15="http://schemas.microsoft.com/office/word/2012/wordml" xmlns:w16cex="http://schemas.microsoft.com/office/word/2018/wordml/cex" xmlns:w16cid="http://schemas.microsoft.com/office/word/2016/wordml/cid" xmlns:w16="http://schemas.microsoft.com/office/word/2018/wordml" xmlns:w16du="http://schemas.microsoft.com/office/word/2023/wordml/word16du" xmlns:w16sdtdh="http://schemas.microsoft.com/office/word/2020/wordml/sdtdatahash" xmlns:w16sdtfl="http://schemas.microsoft.com/office/word/2024/wordml/sdtformatlock" xmlns:w16se="http://schemas.microsoft.com/office/word/2015/wordml/symex" xmlns:wpg="http://schemas.microsoft.com/office/word/2010/wordprocessingGroup" xmlns:wpi="http://schemas.microsoft.com/office/word/2010/wordprocessingInk" xmlns:wne="http://schemas.microsoft.com/office/word/2006/wordml" xmlns:wps="http://schemas.microsoft.com/office/word/2010/wordprocessingShape" mc:Ignorable="w14 w15 w16se w16cid w16 w16cex w16sdtdh w16sdtfl w16du wp14">
   <w:body>
     <w:p>
+      <w:pPr>
+        <w:spacing w:line="240" w:lineRule="auto"/>
+      </w:pPr>
       <w:r>
         <w:t>Caleb Acree</w:t>
       </w:r>
     </w:p>
     <w:p>
+      <w:pPr>
+        <w:spacing w:line="240" w:lineRule="auto"/>
+      </w:pPr>
       <w:r>
         <w:t>XTEA Project</w:t>
       </w:r>
     </w:p>
     <w:p>
       <w:pPr>
-        <w:spacing w:line="480" w:lineRule="auto"/>
+        <w:spacing w:line="360" w:lineRule="auto"/>
       </w:pPr>
       <w:r>
         <w:t>3/16/2026</w:t>
@@ -22,7 +28,7 @@
     </w:p>
     <w:p>
       <w:pPr>
-        <w:spacing w:line="480" w:lineRule="auto"/>
+        <w:spacing w:line="360" w:lineRule="auto"/>
       </w:pPr>
       <w:r>
         <w:tab/>
@@ -51,7 +57,7 @@
     </w:p>
     <w:p>
       <w:pPr>
-        <w:spacing w:line="480" w:lineRule="auto"/>
+        <w:spacing w:line="360" w:lineRule="auto"/>
       </w:pPr>
       <w:r>
         <w:tab/>
@@ -74,6 +80,521 @@
       </w:r>
       <w:r>
         <w:t xml:space="preserve"> bit was chosen because it ensures that the two selectors in the same cycle are never equal. </w:t>
+      </w:r>
+    </w:p>
+    <w:p>
+      <w:pPr>
+        <w:spacing w:line="360" w:lineRule="auto"/>
+      </w:pPr>
+    </w:p>
+    <w:p>
+      <w:pPr>
+        <w:spacing w:line="360" w:lineRule="auto"/>
+      </w:pPr>
+    </w:p>
+    <w:p>
+      <w:pPr>
+        <w:spacing w:line="360" w:lineRule="auto"/>
+      </w:pPr>
+    </w:p>
+    <w:p>
+      <w:pPr>
+        <w:spacing w:line="360" w:lineRule="auto"/>
+      </w:pPr>
+    </w:p>
+    <w:p>
+      <w:pPr>
+        <w:spacing w:line="360" w:lineRule="auto"/>
+      </w:pPr>
+    </w:p>
+    <w:p>
+      <w:pPr>
+        <w:spacing w:line="360" w:lineRule="auto"/>
+      </w:pPr>
+    </w:p>
+    <w:p>
+      <w:pPr>
+        <w:spacing w:line="360" w:lineRule="auto"/>
+      </w:pPr>
+    </w:p>
+    <w:p>
+      <w:pPr>
+        <w:spacing w:line="360" w:lineRule="auto"/>
+      </w:pPr>
+    </w:p>
+    <w:p>
+      <w:pPr>
+        <w:spacing w:line="240" w:lineRule="auto"/>
+      </w:pPr>
+      <w:r>
+        <w:lastRenderedPageBreak/>
+        <w:t xml:space="preserve">Identify the signal names we will use in Quartus: </w:t>
+      </w:r>
+    </w:p>
+    <w:p>
+      <w:pPr>
+        <w:spacing w:line="240" w:lineRule="auto"/>
+        <w:ind w:left="720"/>
+      </w:pPr>
+      <w:r>
+        <w:t xml:space="preserve">Clock: </w:t>
+      </w:r>
+    </w:p>
+    <w:p>
+      <w:pPr>
+        <w:spacing w:line="240" w:lineRule="auto"/>
+        <w:ind w:left="1440"/>
+      </w:pPr>
+      <w:r>
+        <w:t>CLOCK_50</w:t>
+      </w:r>
+      <w:r>
+        <w:t xml:space="preserve">: </w:t>
+      </w:r>
+      <w:r>
+        <w:t>PIN_N2</w:t>
+      </w:r>
+    </w:p>
+    <w:p>
+      <w:pPr>
+        <w:spacing w:line="240" w:lineRule="auto"/>
+        <w:ind w:left="720"/>
+      </w:pPr>
+      <w:r>
+        <w:t xml:space="preserve">PS/2: </w:t>
+      </w:r>
+    </w:p>
+    <w:p>
+      <w:pPr>
+        <w:spacing w:line="240" w:lineRule="auto"/>
+        <w:ind w:left="1440"/>
+      </w:pPr>
+      <w:r>
+        <w:t>PS2_KBCLK</w:t>
+      </w:r>
+      <w:r>
+        <w:t>:</w:t>
+      </w:r>
+      <w:r>
+        <w:t xml:space="preserve"> PIN_C24</w:t>
+      </w:r>
+    </w:p>
+    <w:p>
+      <w:pPr>
+        <w:spacing w:line="240" w:lineRule="auto"/>
+        <w:ind w:left="1440"/>
+      </w:pPr>
+      <w:r>
+        <w:t>PS2_KBDAT</w:t>
+      </w:r>
+      <w:r>
+        <w:t>:</w:t>
+      </w:r>
+      <w:r>
+        <w:t xml:space="preserve"> PIN_D26</w:t>
+      </w:r>
+    </w:p>
+    <w:p>
+      <w:pPr>
+        <w:spacing w:line="240" w:lineRule="auto"/>
+        <w:ind w:left="720"/>
+      </w:pPr>
+      <w:r>
+        <w:t xml:space="preserve">LCD: </w:t>
+      </w:r>
+    </w:p>
+    <w:p>
+      <w:pPr>
+        <w:spacing w:line="240" w:lineRule="auto"/>
+        <w:ind w:left="1440"/>
+      </w:pPr>
+      <w:r>
+        <w:t>LCD_ON</w:t>
+      </w:r>
+      <w:r>
+        <w:t>:</w:t>
+      </w:r>
+      <w:r>
+        <w:t xml:space="preserve"> PIN_L4</w:t>
+      </w:r>
+    </w:p>
+    <w:p>
+      <w:pPr>
+        <w:spacing w:line="240" w:lineRule="auto"/>
+        <w:ind w:left="1440"/>
+      </w:pPr>
+      <w:r>
+        <w:t>LCD_BLON</w:t>
+      </w:r>
+      <w:r>
+        <w:t>:</w:t>
+      </w:r>
+      <w:r>
+        <w:t xml:space="preserve"> </w:t>
+      </w:r>
+      <w:r>
+        <w:t>PIN_</w:t>
+      </w:r>
+      <w:r>
+        <w:t>K2</w:t>
+      </w:r>
+    </w:p>
+    <w:p>
+      <w:pPr>
+        <w:spacing w:line="240" w:lineRule="auto"/>
+        <w:ind w:left="1440"/>
+      </w:pPr>
+      <w:r>
+        <w:t>LCD_EN</w:t>
+      </w:r>
+      <w:r>
+        <w:t>:</w:t>
+      </w:r>
+      <w:r>
+        <w:t xml:space="preserve"> </w:t>
+      </w:r>
+      <w:r>
+        <w:t>PIN_</w:t>
+      </w:r>
+      <w:r>
+        <w:t>K3</w:t>
+      </w:r>
+    </w:p>
+    <w:p>
+      <w:pPr>
+        <w:spacing w:line="240" w:lineRule="auto"/>
+        <w:ind w:left="1440"/>
+      </w:pPr>
+      <w:r>
+        <w:t>LCD_RS</w:t>
+      </w:r>
+      <w:r>
+        <w:t xml:space="preserve">: </w:t>
+      </w:r>
+      <w:r>
+        <w:t>PIN_</w:t>
+      </w:r>
+      <w:r>
+        <w:t>K1</w:t>
+      </w:r>
+    </w:p>
+    <w:p>
+      <w:pPr>
+        <w:spacing w:line="240" w:lineRule="auto"/>
+        <w:ind w:left="1440"/>
+      </w:pPr>
+      <w:r>
+        <w:t>LCD_RW</w:t>
+      </w:r>
+      <w:r>
+        <w:t xml:space="preserve">: </w:t>
+      </w:r>
+      <w:r>
+        <w:t>PIN_</w:t>
+      </w:r>
+      <w:r>
+        <w:t>K4</w:t>
+      </w:r>
+    </w:p>
+    <w:p>
+      <w:pPr>
+        <w:spacing w:line="240" w:lineRule="auto"/>
+        <w:ind w:left="1440"/>
+      </w:pPr>
+      <w:r>
+        <w:t>LCD_</w:t>
+      </w:r>
+      <w:proofErr w:type="gramStart"/>
+      <w:r>
+        <w:t>DATA[7..</w:t>
+      </w:r>
+      <w:proofErr w:type="gramEnd"/>
+      <w:r>
+        <w:t>0]</w:t>
+      </w:r>
+      <w:r>
+        <w:t>:</w:t>
+      </w:r>
+    </w:p>
+    <w:p>
+      <w:pPr>
+        <w:spacing w:line="240" w:lineRule="auto"/>
+        <w:ind w:left="1800"/>
+      </w:pPr>
+      <w:r>
+        <w:t xml:space="preserve">0: </w:t>
+      </w:r>
+      <w:r>
+        <w:t>PIN_</w:t>
+      </w:r>
+      <w:r>
+        <w:t>J1</w:t>
+      </w:r>
+    </w:p>
+    <w:p>
+      <w:pPr>
+        <w:spacing w:line="240" w:lineRule="auto"/>
+        <w:ind w:left="1800"/>
+      </w:pPr>
+      <w:r>
+        <w:t>1:</w:t>
+      </w:r>
+      <w:r>
+        <w:t xml:space="preserve"> </w:t>
+      </w:r>
+      <w:r>
+        <w:t>PIN_</w:t>
+      </w:r>
+      <w:r>
+        <w:t>J2</w:t>
+      </w:r>
+    </w:p>
+    <w:p>
+      <w:pPr>
+        <w:spacing w:line="240" w:lineRule="auto"/>
+        <w:ind w:left="1800"/>
+      </w:pPr>
+      <w:r>
+        <w:t>2:</w:t>
+      </w:r>
+      <w:r>
+        <w:t xml:space="preserve"> </w:t>
+      </w:r>
+      <w:r>
+        <w:t>PIN_</w:t>
+      </w:r>
+      <w:r>
+        <w:t>H1</w:t>
+      </w:r>
+    </w:p>
+    <w:p>
+      <w:pPr>
+        <w:spacing w:line="240" w:lineRule="auto"/>
+        <w:ind w:left="1800"/>
+      </w:pPr>
+      <w:r>
+        <w:t>3:</w:t>
+      </w:r>
+      <w:r>
+        <w:t xml:space="preserve"> </w:t>
+      </w:r>
+      <w:r>
+        <w:t>PIN_</w:t>
+      </w:r>
+      <w:r>
+        <w:t>H2</w:t>
+      </w:r>
+    </w:p>
+    <w:p>
+      <w:pPr>
+        <w:spacing w:line="240" w:lineRule="auto"/>
+        <w:ind w:left="1800"/>
+      </w:pPr>
+      <w:r>
+        <w:t>4:</w:t>
+      </w:r>
+      <w:r>
+        <w:t xml:space="preserve"> </w:t>
+      </w:r>
+      <w:r>
+        <w:t>PIN_</w:t>
+      </w:r>
+      <w:r>
+        <w:t>J4</w:t>
+      </w:r>
+    </w:p>
+    <w:p>
+      <w:pPr>
+        <w:spacing w:line="240" w:lineRule="auto"/>
+        <w:ind w:left="1800"/>
+      </w:pPr>
+      <w:r>
+        <w:t>5:</w:t>
+      </w:r>
+      <w:r>
+        <w:t xml:space="preserve"> </w:t>
+      </w:r>
+      <w:r>
+        <w:t>PIN_</w:t>
+      </w:r>
+      <w:r>
+        <w:t>J3</w:t>
+      </w:r>
+    </w:p>
+    <w:p>
+      <w:pPr>
+        <w:spacing w:line="240" w:lineRule="auto"/>
+        <w:ind w:left="1800"/>
+      </w:pPr>
+      <w:r>
+        <w:t>6:</w:t>
+      </w:r>
+      <w:r>
+        <w:t xml:space="preserve"> </w:t>
+      </w:r>
+      <w:r>
+        <w:t>PIN_</w:t>
+      </w:r>
+      <w:r>
+        <w:t>H4</w:t>
+      </w:r>
+    </w:p>
+    <w:p>
+      <w:pPr>
+        <w:spacing w:line="240" w:lineRule="auto"/>
+        <w:ind w:left="1800"/>
+      </w:pPr>
+      <w:r>
+        <w:t>7:</w:t>
+      </w:r>
+      <w:r>
+        <w:t xml:space="preserve"> </w:t>
+      </w:r>
+      <w:r>
+        <w:t>PIN_</w:t>
+      </w:r>
+      <w:r>
+        <w:t>H3</w:t>
+      </w:r>
+    </w:p>
+    <w:p>
+      <w:pPr>
+        <w:spacing w:line="240" w:lineRule="auto"/>
+      </w:pPr>
+    </w:p>
+    <w:p>
+      <w:pPr>
+        <w:spacing w:line="240" w:lineRule="auto"/>
+      </w:pPr>
+    </w:p>
+    <w:p>
+      <w:pPr>
+        <w:spacing w:line="240" w:lineRule="auto"/>
+      </w:pPr>
+    </w:p>
+    <w:p>
+      <w:pPr>
+        <w:spacing w:line="240" w:lineRule="auto"/>
+      </w:pPr>
+    </w:p>
+    <w:p>
+      <w:pPr>
+        <w:spacing w:line="240" w:lineRule="auto"/>
+      </w:pPr>
+    </w:p>
+    <w:p>
+      <w:pPr>
+        <w:spacing w:line="240" w:lineRule="auto"/>
+      </w:pPr>
+    </w:p>
+    <w:p>
+      <w:pPr>
+        <w:spacing w:line="240" w:lineRule="auto"/>
+      </w:pPr>
+    </w:p>
+    <w:p>
+      <w:pPr>
+        <w:ind w:firstLine="720"/>
+      </w:pPr>
+      <w:r>
+        <w:lastRenderedPageBreak/>
+        <w:t xml:space="preserve">It creates a dummy environment around the actual XTEA circuit. It provides the inputs it needs and then monitors the outputs. The line always `#5 </w:t>
+      </w:r>
+      <w:proofErr w:type="spellStart"/>
+      <w:r>
+        <w:t>clk</w:t>
+      </w:r>
+      <w:proofErr w:type="spellEnd"/>
+      <w:r>
+        <w:t>=~</w:t>
+      </w:r>
+      <w:proofErr w:type="spellStart"/>
+      <w:r>
+        <w:t>clk</w:t>
+      </w:r>
+      <w:proofErr w:type="spellEnd"/>
+      <w:r>
+        <w:t>` just generates a clock signal that flips every 5 nanoseconds, creating a 10ns clock period. It does this so it is actually able to advance through its rounds. The next part takes three arguments: a key K, a plaintext P, and a known-correct ciphertext C. It then does the next two things in sequence. First it feeds the circuit K and P with enc=1 (encrypt), waits for done to go high, and then checks whether the output matches C. If it doesn't, it prints an error message and calls `$stop`. This halts the simulation. After the halt is resolved it feeds K and C back in with enc=0 (decrypt), waits for the done signal. Lastly it checks whether the output matches the original P. So, every vector tests both directions; both have to be correct to pass. The initial block holds the circuit in reset for 5 clock cycles. Then releases it and runs `</w:t>
+      </w:r>
+      <w:proofErr w:type="spellStart"/>
+      <w:r>
+        <w:t>run_vec</w:t>
+      </w:r>
+      <w:proofErr w:type="spellEnd"/>
+      <w:r>
+        <w:t>` four times with the pre-computed key/plaintext/ciphertext combinations. If the circuit creates matching outputs, it's implemented correctly. Failure is indicated by the `$stop` printing a message. Success is indicated by reaching the last line `$</w:t>
+      </w:r>
+      <w:proofErr w:type="gramStart"/>
+      <w:r>
+        <w:t>display(</w:t>
+      </w:r>
+      <w:proofErr w:type="gramEnd"/>
+      <w:r>
+        <w:t>"All XTEA tests passed.</w:t>
+      </w:r>
+      <w:proofErr w:type="gramStart"/>
+      <w:r>
+        <w:t>")`</w:t>
+      </w:r>
+      <w:proofErr w:type="gramEnd"/>
+      <w:r>
+        <w:t>. Lastly followed by `$finish`, which happens if all four `</w:t>
+      </w:r>
+      <w:proofErr w:type="spellStart"/>
+      <w:r>
+        <w:t>run_vec</w:t>
+      </w:r>
+      <w:proofErr w:type="spellEnd"/>
+      <w:r>
+        <w:t xml:space="preserve">` calls completed without encountering an error. </w:t>
+      </w:r>
+    </w:p>
+    <w:p>
+      <w:pPr>
+        <w:ind w:firstLine="720"/>
+      </w:pPr>
+    </w:p>
+    <w:p>
+      <w:pPr>
+        <w:spacing w:line="360" w:lineRule="auto"/>
+      </w:pPr>
+      <w:r>
+        <w:t xml:space="preserve">ESD: Touch a grounded metal surface before or use </w:t>
+      </w:r>
+      <w:proofErr w:type="gramStart"/>
+      <w:r>
+        <w:t>a</w:t>
+      </w:r>
+      <w:proofErr w:type="gramEnd"/>
+      <w:r>
+        <w:t xml:space="preserve"> anti-static wrist band while handling the board.</w:t>
+      </w:r>
+    </w:p>
+    <w:p>
+      <w:pPr>
+        <w:spacing w:line="360" w:lineRule="auto"/>
+      </w:pPr>
+      <w:r>
+        <w:t xml:space="preserve">Power-up Sequence: </w:t>
+      </w:r>
+      <w:r>
+        <w:t xml:space="preserve">Connect all cables while the board is unpowered. Power on the FPGA board. Upload project from </w:t>
+      </w:r>
+      <w:proofErr w:type="spellStart"/>
+      <w:r>
+        <w:t>quartus</w:t>
+      </w:r>
+      <w:proofErr w:type="spellEnd"/>
+      <w:r>
+        <w:t>.</w:t>
+      </w:r>
+    </w:p>
+    <w:p>
+      <w:pPr>
+        <w:spacing w:line="360" w:lineRule="auto"/>
+      </w:pPr>
+      <w:r>
+        <w:t>Cable handling: connect and disconnect PS2 cables while board power is off. Otherwise, it can damage the board.</w:t>
       </w:r>
     </w:p>
     <w:sectPr>
@@ -84,6 +605,224 @@
     </w:sectPr>
   </w:body>
 </w:document>
+</file>
+
+<file path=word/numbering.xml><?xml version="1.0" encoding="utf-8"?>
+<w:numbering xmlns:wpc="http://schemas.microsoft.com/office/word/2010/wordprocessingCanvas" xmlns:cx="http://schemas.microsoft.com/office/drawing/2014/chartex" xmlns:cx1="http://schemas.microsoft.com/office/drawing/2015/9/8/chartex" xmlns:cx2="http://schemas.microsoft.com/office/drawing/2015/10/21/chartex" xmlns:cx3="http://schemas.microsoft.com/office/drawing/2016/5/9/chartex" xmlns:cx4="http://schemas.microsoft.com/office/drawing/2016/5/10/chartex" xmlns:cx5="http://schemas.microsoft.com/office/drawing/2016/5/11/chartex" xmlns:cx6="http://schemas.microsoft.com/office/drawing/2016/5/12/chartex" xmlns:cx7="http://schemas.microsoft.com/office/drawing/2016/5/13/chartex" xmlns:cx8="http://schemas.microsoft.com/office/drawing/2016/5/14/chartex" xmlns:mc="http://schemas.openxmlformats.org/markup-compatibility/2006" xmlns:aink="http://schemas.microsoft.com/office/drawing/2016/ink" xmlns:am3d="http://schemas.microsoft.com/office/drawing/2017/model3d" xmlns:o="urn:schemas-microsoft-com:office:office" xmlns:oel="http://schemas.microsoft.com/office/2019/extlst" xmlns:r="http://schemas.openxmlformats.org/officeDocument/2006/relationships" xmlns:m="http://schemas.openxmlformats.org/officeDocument/2006/math" xmlns:v="urn:schemas-microsoft-com:vml" xmlns:wp14="http://schemas.microsoft.com/office/word/2010/wordprocessingDrawing" xmlns:wp="http://schemas.openxmlformats.org/drawingml/2006/wordprocessingDrawing" xmlns:w10="urn:schemas-microsoft-com:office:word" xmlns:w="http://schemas.openxmlformats.org/wordprocessingml/2006/main" xmlns:w14="http://schemas.microsoft.com/office/word/2010/wordml" xmlns:w15="http://schemas.microsoft.com/office/word/2012/wordml" xmlns:w16cex="http://schemas.microsoft.com/office/word/2018/wordml/cex" xmlns:w16cid="http://schemas.microsoft.com/office/word/2016/wordml/cid" xmlns:w16="http://schemas.microsoft.com/office/word/2018/wordml" xmlns:w16du="http://schemas.microsoft.com/office/word/2023/wordml/word16du" xmlns:w16sdtdh="http://schemas.microsoft.com/office/word/2020/wordml/sdtdatahash" xmlns:w16sdtfl="http://schemas.microsoft.com/office/word/2024/wordml/sdtformatlock" xmlns:w16se="http://schemas.microsoft.com/office/word/2015/wordml/symex" xmlns:wpg="http://schemas.microsoft.com/office/word/2010/wordprocessingGroup" xmlns:wpi="http://schemas.microsoft.com/office/word/2010/wordprocessingInk" xmlns:wne="http://schemas.microsoft.com/office/word/2006/wordml" xmlns:wps="http://schemas.microsoft.com/office/word/2010/wordprocessingShape" mc:Ignorable="w14 w15 w16se w16cid w16 w16cex w16sdtdh w16sdtfl w16du wp14">
+  <w:abstractNum w:abstractNumId="0" w15:restartNumberingAfterBreak="0">
+    <w:nsid w:val="25A037C7"/>
+    <w:multiLevelType w:val="multilevel"/>
+    <w:tmpl w:val="0FAA4036"/>
+    <w:lvl w:ilvl="0">
+      <w:start w:val="1"/>
+      <w:numFmt w:val="decimal"/>
+      <w:lvlText w:val="%1."/>
+      <w:lvlJc w:val="left"/>
+      <w:pPr>
+        <w:tabs>
+          <w:tab w:val="num" w:pos="720"/>
+        </w:tabs>
+        <w:ind w:left="720" w:hanging="360"/>
+      </w:pPr>
+    </w:lvl>
+    <w:lvl w:ilvl="1">
+      <w:start w:val="1"/>
+      <w:numFmt w:val="bullet"/>
+      <w:lvlText w:val="o"/>
+      <w:lvlJc w:val="left"/>
+      <w:pPr>
+        <w:tabs>
+          <w:tab w:val="num" w:pos="1440"/>
+        </w:tabs>
+        <w:ind w:left="1440" w:hanging="360"/>
+      </w:pPr>
+      <w:rPr>
+        <w:rFonts w:ascii="Courier New" w:hAnsi="Courier New" w:hint="default"/>
+        <w:sz w:val="20"/>
+      </w:rPr>
+    </w:lvl>
+    <w:lvl w:ilvl="2">
+      <w:start w:val="1"/>
+      <w:numFmt w:val="bullet"/>
+      <w:lvlText w:val=""/>
+      <w:lvlJc w:val="left"/>
+      <w:pPr>
+        <w:tabs>
+          <w:tab w:val="num" w:pos="2160"/>
+        </w:tabs>
+        <w:ind w:left="2160" w:hanging="360"/>
+      </w:pPr>
+      <w:rPr>
+        <w:rFonts w:ascii="Wingdings" w:hAnsi="Wingdings" w:hint="default"/>
+        <w:sz w:val="20"/>
+      </w:rPr>
+    </w:lvl>
+    <w:lvl w:ilvl="3" w:tentative="1">
+      <w:start w:val="1"/>
+      <w:numFmt w:val="decimal"/>
+      <w:lvlText w:val="%4."/>
+      <w:lvlJc w:val="left"/>
+      <w:pPr>
+        <w:tabs>
+          <w:tab w:val="num" w:pos="2880"/>
+        </w:tabs>
+        <w:ind w:left="2880" w:hanging="360"/>
+      </w:pPr>
+    </w:lvl>
+    <w:lvl w:ilvl="4" w:tentative="1">
+      <w:start w:val="1"/>
+      <w:numFmt w:val="decimal"/>
+      <w:lvlText w:val="%5."/>
+      <w:lvlJc w:val="left"/>
+      <w:pPr>
+        <w:tabs>
+          <w:tab w:val="num" w:pos="3600"/>
+        </w:tabs>
+        <w:ind w:left="3600" w:hanging="360"/>
+      </w:pPr>
+    </w:lvl>
+    <w:lvl w:ilvl="5" w:tentative="1">
+      <w:start w:val="1"/>
+      <w:numFmt w:val="decimal"/>
+      <w:lvlText w:val="%6."/>
+      <w:lvlJc w:val="left"/>
+      <w:pPr>
+        <w:tabs>
+          <w:tab w:val="num" w:pos="4320"/>
+        </w:tabs>
+        <w:ind w:left="4320" w:hanging="360"/>
+      </w:pPr>
+    </w:lvl>
+    <w:lvl w:ilvl="6" w:tentative="1">
+      <w:start w:val="1"/>
+      <w:numFmt w:val="decimal"/>
+      <w:lvlText w:val="%7."/>
+      <w:lvlJc w:val="left"/>
+      <w:pPr>
+        <w:tabs>
+          <w:tab w:val="num" w:pos="5040"/>
+        </w:tabs>
+        <w:ind w:left="5040" w:hanging="360"/>
+      </w:pPr>
+    </w:lvl>
+    <w:lvl w:ilvl="7" w:tentative="1">
+      <w:start w:val="1"/>
+      <w:numFmt w:val="decimal"/>
+      <w:lvlText w:val="%8."/>
+      <w:lvlJc w:val="left"/>
+      <w:pPr>
+        <w:tabs>
+          <w:tab w:val="num" w:pos="5760"/>
+        </w:tabs>
+        <w:ind w:left="5760" w:hanging="360"/>
+      </w:pPr>
+    </w:lvl>
+    <w:lvl w:ilvl="8" w:tentative="1">
+      <w:start w:val="1"/>
+      <w:numFmt w:val="decimal"/>
+      <w:lvlText w:val="%9."/>
+      <w:lvlJc w:val="left"/>
+      <w:pPr>
+        <w:tabs>
+          <w:tab w:val="num" w:pos="6480"/>
+        </w:tabs>
+        <w:ind w:left="6480" w:hanging="360"/>
+      </w:pPr>
+    </w:lvl>
+  </w:abstractNum>
+  <w:abstractNum w:abstractNumId="1" w15:restartNumberingAfterBreak="0">
+    <w:nsid w:val="7E0E3875"/>
+    <w:multiLevelType w:val="multilevel"/>
+    <w:tmpl w:val="0409001D"/>
+    <w:lvl w:ilvl="0">
+      <w:start w:val="1"/>
+      <w:numFmt w:val="decimal"/>
+      <w:lvlText w:val="%1)"/>
+      <w:lvlJc w:val="left"/>
+      <w:pPr>
+        <w:ind w:left="360" w:hanging="360"/>
+      </w:pPr>
+    </w:lvl>
+    <w:lvl w:ilvl="1">
+      <w:start w:val="1"/>
+      <w:numFmt w:val="lowerLetter"/>
+      <w:lvlText w:val="%2)"/>
+      <w:lvlJc w:val="left"/>
+      <w:pPr>
+        <w:ind w:left="720" w:hanging="360"/>
+      </w:pPr>
+    </w:lvl>
+    <w:lvl w:ilvl="2">
+      <w:start w:val="1"/>
+      <w:numFmt w:val="lowerRoman"/>
+      <w:lvlText w:val="%3)"/>
+      <w:lvlJc w:val="left"/>
+      <w:pPr>
+        <w:ind w:left="1080" w:hanging="360"/>
+      </w:pPr>
+    </w:lvl>
+    <w:lvl w:ilvl="3">
+      <w:start w:val="1"/>
+      <w:numFmt w:val="decimal"/>
+      <w:lvlText w:val="(%4)"/>
+      <w:lvlJc w:val="left"/>
+      <w:pPr>
+        <w:ind w:left="1440" w:hanging="360"/>
+      </w:pPr>
+    </w:lvl>
+    <w:lvl w:ilvl="4">
+      <w:start w:val="1"/>
+      <w:numFmt w:val="lowerLetter"/>
+      <w:lvlText w:val="(%5)"/>
+      <w:lvlJc w:val="left"/>
+      <w:pPr>
+        <w:ind w:left="1800" w:hanging="360"/>
+      </w:pPr>
+    </w:lvl>
+    <w:lvl w:ilvl="5">
+      <w:start w:val="1"/>
+      <w:numFmt w:val="lowerRoman"/>
+      <w:lvlText w:val="(%6)"/>
+      <w:lvlJc w:val="left"/>
+      <w:pPr>
+        <w:ind w:left="2160" w:hanging="360"/>
+      </w:pPr>
+    </w:lvl>
+    <w:lvl w:ilvl="6">
+      <w:start w:val="1"/>
+      <w:numFmt w:val="decimal"/>
+      <w:lvlText w:val="%7."/>
+      <w:lvlJc w:val="left"/>
+      <w:pPr>
+        <w:ind w:left="2520" w:hanging="360"/>
+      </w:pPr>
+    </w:lvl>
+    <w:lvl w:ilvl="7">
+      <w:start w:val="1"/>
+      <w:numFmt w:val="lowerLetter"/>
+      <w:lvlText w:val="%8."/>
+      <w:lvlJc w:val="left"/>
+      <w:pPr>
+        <w:ind w:left="2880" w:hanging="360"/>
+      </w:pPr>
+    </w:lvl>
+    <w:lvl w:ilvl="8">
+      <w:start w:val="1"/>
+      <w:numFmt w:val="lowerRoman"/>
+      <w:lvlText w:val="%9."/>
+      <w:lvlJc w:val="left"/>
+      <w:pPr>
+        <w:ind w:left="3240" w:hanging="360"/>
+      </w:pPr>
+    </w:lvl>
+  </w:abstractNum>
+  <w:num w:numId="1" w16cid:durableId="1642035965">
+    <w:abstractNumId w:val="0"/>
+  </w:num>
+  <w:num w:numId="2" w16cid:durableId="1691880071">
+    <w:abstractNumId w:val="1"/>
+  </w:num>
+</w:numbering>
 </file>
 
 <file path=word/styles.xml><?xml version="1.0" encoding="utf-8"?>

</xml_diff>